<commit_message>
docs: intégrer les réponses d'Alexis (chat V2, tarif à revoir, battement)
- Chat client : confirmé souhaité mais explicitement pas développé en
  V1, déplacé en "reporté V2". Contact V1 = téléphone/email uniquement.
- Nouveau modèle tarifaire annoncé par la cliente (2€/jour, tous les
  sets) : flaggé comme point bloquant majeur (⚠️) sans rien modifier
  au tunnel, à la grille ni aux bons cadeaux tant qu'Alexis n'a pas
  clarifié comment ça s'articule avec les 4 durées fixes actuelles.
- Reformulation de la question sur le battement lors d'une
  prolongation immédiate avec un exemple concret, suite à une demande
  de clarification.
- Précision : le calcul du "% de pertes" du barème est déterminé par
  Set et Brique, à leur demander explicitement.

Co-Authored-By: Claude Sonnet 5 <noreply@anthropic.com>
</commit_message>
<xml_diff>
--- a/docs/projet-plateforme-location/specification-fonctionnelle.docx
+++ b/docs/projet-plateforme-location/specification-fonctionnelle.docx
@@ -918,7 +918,7 @@
       </w:pPr>
       <w:r>
         <w:rPr/>
-        <w:t xml:space="preserve">✅ </w:t>
+        <w:t xml:space="preserve">⚠️ </w:t>
       </w:r>
       <w:r>
         <w:rPr/>
@@ -928,11 +928,21 @@
         <w:rPr>
           <w:rStyle w:val="Accentuationforte"/>
         </w:rPr>
-        <w:t>Pas de durée maximale de location</w:t>
-      </w:r>
-      <w:r>
-        <w:rPr/>
-        <w:t xml:space="preserve"> côté entreprise (confirmé par la cliente), mais le tunnel ne propose toujours que les 4 durées : au-delà, cf. règle de prolongation ci-dessous. </w:t>
+        <w:t>Ce point est remis en question</w:t>
+      </w:r>
+      <w:r>
+        <w:rPr/>
+        <w:t xml:space="preserve"> par le nouveau modèle tarifaire annoncé par la cliente (2 €/jour, tous les sets — cf. README, section tarifaire) : si la durée devient libre en nombre de jours plutôt que fixée à 4 paliers, cette règle et tout le tunnel de réservation doivent être repensés. </w:t>
+      </w:r>
+      <w:r>
+        <w:rPr>
+          <w:rStyle w:val="Accentuationforte"/>
+        </w:rPr>
+        <w:t>Ne pas développer le sélecteur de durée tant que ce point n'est pas éclairci avec Alexis.</w:t>
+      </w:r>
+      <w:r>
+        <w:rPr/>
+        <w:t xml:space="preserve"> Pas de durée maximale de location côté entreprise (confirmé par la cliente), quel que soit le modèle tarifaire retenu. </w:t>
       </w:r>
     </w:p>
     <w:p>
@@ -964,7 +974,7 @@
       </w:r>
       <w:r>
         <w:rPr/>
-        <w:t xml:space="preserve"> L'heure exacte de remise est négociée directement avec le client via chat/téléphone/email après la réservation — pas de sélecteur d'horaire dans le tunnel en V1. (Confirmé par la cliente ; elle envisage d'ajouter une tranche horaire plus tard, cf. section V2.) </w:t>
+        <w:t xml:space="preserve"> L'heure exacte de remise est négociée directement avec le client par téléphone/email en V1 (un outil de chat est souhaité par la cliente mais explicitement pas développé pour l'instant — cf. section V2) — pas de sélecteur d'horaire dans le tunnel en V1. (Confirmé par la cliente ; elle envisage d'ajouter une tranche horaire plus tard, cf. section V2.) </w:t>
       </w:r>
     </w:p>
     <w:p>
@@ -1038,7 +1048,7 @@
       </w:r>
       <w:r>
         <w:rPr/>
-        <w:t xml:space="preserve">. Le client contacte Set et Brique (téléphone, chat ou email) pour vérifier la disponibilité, puis effectue lui-même une </w:t>
+        <w:t xml:space="preserve">. Le client contacte Set et Brique (téléphone ou email — pas de chat en V1) pour vérifier la disponibilité, puis effectue lui-même une </w:t>
       </w:r>
       <w:r>
         <w:rPr>
@@ -1073,8 +1083,24 @@
         <w:t xml:space="preserve">⏳ </w:t>
       </w:r>
       <w:r>
-        <w:rPr/>
-        <w:t xml:space="preserve">Cette nouvelle réservation « à la suite » doit-elle sauter le délai de battement (puisque le set n'est jamais physiquement rendu entre les deux réservations), ou le système la traite-t-il comme une location normale avec battement standard, obligeant Marion à l'ajuster manuellement au cas par cas ? </w:t>
+        <w:rPr>
+          <w:rStyle w:val="Accentuationforte"/>
+        </w:rPr>
+        <w:t>Battement lors d'une prolongation immédiate — exemple concret</w:t>
+      </w:r>
+      <w:r>
+        <w:rPr/>
+        <w:t xml:space="preserve"> : un client loue le Faucon Millénium du 1er au 8, puis décide de le garder plus longtemps et réserve lui-même, via le tunnel, une nouvelle location du 9 au 15 </w:t>
+      </w:r>
+      <w:r>
+        <w:rPr>
+          <w:rStyle w:val="Accentuation"/>
+        </w:rPr>
+        <w:t>pour ce même set qu'il a déjà en main</w:t>
+      </w:r>
+      <w:r>
+        <w:rPr/>
+        <w:t xml:space="preserve"> (il ne le rend jamais entre les deux réservations). Le délai de battement standard (4 jours par défaut, prévu pour que Marion nettoie/vérifie le set entre deux locataires différents) n'a ici aucune raison d'exister puisque rien n'est physiquement rendu. Question : le système doit-il quand même imposer ce délai entre les deux réservations du même client (ce qui bloquerait cette prolongation en pratique), ou faut-il le sauter spécifiquement dans ce cas ? </w:t>
       </w:r>
     </w:p>
     <w:p>
@@ -1096,36 +1122,52 @@
       </w:pPr>
       <w:r>
         <w:rPr/>
+        <w:t xml:space="preserve">✅ </w:t>
+      </w:r>
+      <w:r>
+        <w:rPr>
+          <w:rStyle w:val="Accentuationforte"/>
+        </w:rPr>
+        <w:t>Outil de chat</w:t>
+      </w:r>
+      <w:r>
+        <w:rPr/>
+        <w:t xml:space="preserve"> : souhaité par la cliente comme canal de contact, mais confirmé par Alexis comme </w:t>
+      </w:r>
+      <w:r>
+        <w:rPr>
+          <w:rStyle w:val="Accentuationforte"/>
+        </w:rPr>
+        <w:t>non développé en V1</w:t>
+      </w:r>
+      <w:r>
+        <w:rPr/>
+        <w:t xml:space="preserve">, éventuellement en V2. </w:t>
+      </w:r>
+    </w:p>
+    <w:p>
+      <w:pPr>
+        <w:pStyle w:val="Corpsdetexte"/>
+        <w:numPr>
+          <w:ilvl w:val="0"/>
+          <w:numId w:val="7"/>
+        </w:numPr>
+        <w:tabs>
+          <w:tab w:val="clear" w:pos="1134"/>
+          <w:tab w:val="left" w:pos="707" w:leader="none"/>
+        </w:tabs>
+        <w:bidi w:val="0"/>
+        <w:ind w:left="707" w:hanging="283"/>
+        <w:jc w:val="left"/>
+        <w:rPr/>
+      </w:pPr>
+      <w:r>
+        <w:rPr/>
         <w:t xml:space="preserve">⏳ </w:t>
       </w:r>
       <w:r>
         <w:rPr/>
-        <w:t xml:space="preserve">« Chat » mentionné comme canal de contact (ici et pour la prise de créneau horaire) — est-ce un outil existant côté cliente (WhatsApp, Messenger...) à référencer simplement sur le site, ou une fonctionnalité de chat en direct à développer sur la plateforme ? Pas dans le périmètre actuel du devis si c'est la 2ᵉ option — à clarifier avant de l'assumer. </w:t>
-      </w:r>
-    </w:p>
-    <w:p>
-      <w:pPr>
-        <w:pStyle w:val="Corpsdetexte"/>
-        <w:numPr>
-          <w:ilvl w:val="0"/>
-          <w:numId w:val="7"/>
-        </w:numPr>
-        <w:tabs>
-          <w:tab w:val="clear" w:pos="1134"/>
-          <w:tab w:val="left" w:pos="707" w:leader="none"/>
-        </w:tabs>
-        <w:bidi w:val="0"/>
-        <w:ind w:left="707" w:hanging="283"/>
-        <w:jc w:val="left"/>
-        <w:rPr/>
-      </w:pPr>
-      <w:r>
-        <w:rPr/>
-        <w:t xml:space="preserve">⏳ </w:t>
-      </w:r>
-      <w:r>
-        <w:rPr/>
-        <w:t xml:space="preserve">Marion doit-elle pouvoir bloquer des dates à l'avance sur le planning (vacances, indisponibilité générale), indépendamment du statut de chaque set ? Non tranché — remonté par Madus en lien avec le délai minimum de réservation. </w:t>
+        <w:t xml:space="preserve">Marion doit-elle pouvoir bloquer des dates à l'avance sur le planning (vacances, indisponibilité générale), indépendamment du statut de chaque set ? Non tranché — remonté par Madus en lien avec le délai minimum de réservation. Possiblement sans objet si la validation manuelle des réservations (module 5) est confirmée. </w:t>
       </w:r>
     </w:p>
     <w:p>
@@ -1154,6 +1196,32 @@
           <w:tab w:val="left" w:pos="707" w:leader="none"/>
         </w:tabs>
         <w:bidi w:val="0"/>
+        <w:spacing w:before="0" w:after="0"/>
+        <w:ind w:left="707" w:hanging="283"/>
+        <w:jc w:val="left"/>
+        <w:rPr/>
+      </w:pPr>
+      <w:r>
+        <w:rPr/>
+        <w:t xml:space="preserve">🔜 </w:t>
+      </w:r>
+      <w:r>
+        <w:rPr/>
+        <w:t xml:space="preserve">Outil de chat pour contacter la cliente — souhaité mais pas développé en V1. </w:t>
+      </w:r>
+    </w:p>
+    <w:p>
+      <w:pPr>
+        <w:pStyle w:val="Corpsdetexte"/>
+        <w:numPr>
+          <w:ilvl w:val="0"/>
+          <w:numId w:val="8"/>
+        </w:numPr>
+        <w:tabs>
+          <w:tab w:val="clear" w:pos="1134"/>
+          <w:tab w:val="left" w:pos="707" w:leader="none"/>
+        </w:tabs>
+        <w:bidi w:val="0"/>
         <w:ind w:left="707" w:hanging="283"/>
         <w:jc w:val="left"/>
         <w:rPr/>
@@ -1929,11 +1997,21 @@
       </w:pPr>
       <w:r>
         <w:rPr/>
-        <w:t xml:space="preserve">✅ </w:t>
-      </w:r>
-      <w:r>
-        <w:rPr/>
-        <w:t xml:space="preserve">Bons vendus aux montants de la grille tarifaire uniquement (10 € / 15 € / 25 € / 45 €) — pas de montant libre. </w:t>
+        <w:t xml:space="preserve">⚠️ </w:t>
+      </w:r>
+      <w:r>
+        <w:rPr/>
+        <w:t xml:space="preserve">Bons vendus aux montants de la grille tarifaire, pas de montant libre — </w:t>
+      </w:r>
+      <w:r>
+        <w:rPr>
+          <w:rStyle w:val="Accentuationforte"/>
+        </w:rPr>
+        <w:t>montants exacts à revoir</w:t>
+      </w:r>
+      <w:r>
+        <w:rPr/>
+        <w:t xml:space="preserve"> : la grille actuelle (10 € / 15 € / 25 € / 45 €) est remise en question par le nouveau modèle tarifaire annoncé par la cliente (2 €/jour, tous les sets). Ne pas figer les montants des bons tant que ce point n'est pas éclairci avec Alexis (cf. module 2 et README). </w:t>
       </w:r>
     </w:p>
     <w:p>
@@ -2051,6 +2129,16 @@
       <w:r>
         <w:rPr/>
         <w:t xml:space="preserve">Un bon doit-il correspondre exactement à une des 4 durées (ex. bon de 15 € utilisable uniquement pour une location de 7 jours), ou est-ce un crédit utilisable pour compléter un paiement plus important avec un autre moyen de paiement pour la différence ? </w:t>
+      </w:r>
+      <w:r>
+        <w:rPr>
+          <w:rStyle w:val="Accentuationforte"/>
+        </w:rPr>
+        <w:t>À reconsidérer une fois le nouveau modèle tarifaire clarifié</w:t>
+      </w:r>
+      <w:r>
+        <w:rPr/>
+        <w:t xml:space="preserve"> — si la durée devient libre en jours, la logique « bon = une des 4 durées » ne tient plus telle quelle. </w:t>
       </w:r>
     </w:p>
     <w:p>
@@ -3629,7 +3717,7 @@
       </w:r>
       <w:r>
         <w:rPr/>
-        <w:t xml:space="preserve">Reste ouvert : comment le « % de pertes » est-il calculé en pratique — à partir de l'écart de poids constaté à la pesée (cf. module 1), ou d'un comptage précis des pièces manquantes par rapport à la notice ? </w:t>
+        <w:t xml:space="preserve">Reste ouvert : comment le « % de pertes » est-il calculé en pratique — à partir de l'écart de poids constaté à la pesée (cf. module 1), ou d'un comptage précis des pièces manquantes par rapport à la notice ? C'est Set et Brique qui détermine cette méthode (Alexis doit le leur demander explicitement). </w:t>
       </w:r>
     </w:p>
     <w:p>
@@ -4045,6 +4133,10 @@
         <w:rPr/>
       </w:pPr>
       <w:r>
+        <w:rPr/>
+        <w:t xml:space="preserve">Cf. README.md pour le détail. </w:t>
+      </w:r>
+      <w:r>
         <w:rPr>
           <w:rStyle w:val="Accentuationforte"/>
         </w:rPr>
@@ -4062,7 +4154,17 @@
       </w:r>
       <w:r>
         <w:rPr/>
-        <w:t xml:space="preserve"> : sujet caution/durée de préautorisation (Swikly, Stripe étendu, PayPal — cf. module 4).</w:t>
+        <w:t xml:space="preserve"> : sujet caution/durée de préautorisation (Swikly, Stripe étendu, PayPal — cf. module 4). </w:t>
+      </w:r>
+      <w:r>
+        <w:rPr>
+          <w:rStyle w:val="Accentuationforte"/>
+        </w:rPr>
+        <w:t>Résolu (réponse d'Alexis) :</w:t>
+      </w:r>
+      <w:r>
+        <w:rPr/>
+        <w:t xml:space="preserve"> nature du « chat » — souhaité mais pas développé en V1, cf. section V2.</w:t>
       </w:r>
     </w:p>
     <w:p>
@@ -4083,8 +4185,20 @@
         <w:rPr/>
       </w:pPr>
       <w:r>
-        <w:rPr/>
-        <w:t xml:space="preserve">Comment le « % de pertes » du barème est-il calculé (écart de poids ou comptage précis) ? (module 9). </w:t>
+        <w:rPr>
+          <w:rStyle w:val="Accentuationforte"/>
+        </w:rPr>
+        <w:t xml:space="preserve">⚠️ </w:t>
+      </w:r>
+      <w:r>
+        <w:rPr>
+          <w:rStyle w:val="Accentuationforte"/>
+        </w:rPr>
+        <w:t>Nouveau modèle tarifaire (2 €/jour, tous les sets)</w:t>
+      </w:r>
+      <w:r>
+        <w:rPr/>
+        <w:t xml:space="preserve"> — Alexis doit d'abord clarifier en interne comment ça s'articule avec les 4 durées fixes actuelles avant qu'on formule la question précise à poser à Marion. Bloque potentiellement : grille tarifaire, montants des bons cadeaux (module 6), fonctionnement du tunnel (module 5, module 2). </w:t>
       </w:r>
     </w:p>
     <w:p>
@@ -4134,6 +4248,28 @@
       </w:pPr>
       <w:r>
         <w:rPr/>
+        <w:t xml:space="preserve">Comment le « % de pertes » du barème est-il calculé (écart de poids ou comptage précis) ? C'est Set et Brique qui détermine cette méthode (module 9). </w:t>
+      </w:r>
+    </w:p>
+    <w:p>
+      <w:pPr>
+        <w:pStyle w:val="Corpsdetexte"/>
+        <w:numPr>
+          <w:ilvl w:val="0"/>
+          <w:numId w:val="29"/>
+        </w:numPr>
+        <w:tabs>
+          <w:tab w:val="clear" w:pos="1134"/>
+          <w:tab w:val="left" w:pos="707" w:leader="none"/>
+        </w:tabs>
+        <w:bidi w:val="0"/>
+        <w:spacing w:before="0" w:after="0"/>
+        <w:ind w:left="707" w:hanging="283"/>
+        <w:jc w:val="left"/>
+        <w:rPr/>
+      </w:pPr>
+      <w:r>
+        <w:rPr/>
         <w:t xml:space="preserve">Gestion du client suivant en cas de non-retour dans les temps (modules 1, 2). </w:t>
       </w:r>
     </w:p>
@@ -4243,8 +4379,14 @@
         <w:rPr/>
       </w:pPr>
       <w:r>
-        <w:rPr/>
-        <w:t xml:space="preserve">Nature du « chat » mentionné par la cliente comme canal de contact : outil existant à référencer, ou fonctionnalité à développer (hors devis actuel si c'est le cas) ? (module 2). </w:t>
+        <w:rPr>
+          <w:rStyle w:val="Accentuationforte"/>
+        </w:rPr>
+        <w:t>Battement lors d'une prolongation immédiate</w:t>
+      </w:r>
+      <w:r>
+        <w:rPr/>
+        <w:t xml:space="preserve"> (même client, même set, sans retour physique entre les deux réservations) — exemple détaillé au module 2 (module 2). </w:t>
       </w:r>
     </w:p>
     <w:p>
@@ -4266,7 +4408,7 @@
       </w:pPr>
       <w:r>
         <w:rPr/>
-        <w:t xml:space="preserve">Battement à appliquer (ou non) lors d'une prolongation immédiate du même client, sans retour physique du set entre les deux réservations (module 2). </w:t>
+        <w:t xml:space="preserve">Bon cadeau = valeur exacte d'une durée, ou crédit complétable par un autre moyen de paiement — à reconsidérer une fois le point 1 clarifié (module 6). </w:t>
       </w:r>
     </w:p>
     <w:p>
@@ -4288,7 +4430,7 @@
       </w:pPr>
       <w:r>
         <w:rPr/>
-        <w:t xml:space="preserve">Bon cadeau = valeur exacte d'une durée, ou crédit complétable par un autre moyen de paiement (module 6). </w:t>
+        <w:t xml:space="preserve">Solde restant d'un bon cadeau partiellement utilisé : conservé ou perdu (module 6). </w:t>
       </w:r>
     </w:p>
     <w:p>
@@ -4310,7 +4452,7 @@
       </w:pPr>
       <w:r>
         <w:rPr/>
-        <w:t xml:space="preserve">Solde restant d'un bon cadeau partiellement utilisé : conservé ou perdu (module 6). </w:t>
+        <w:t xml:space="preserve">Bon cadeau nominatif ou utilisable par toute personne détenant le code (module 6). </w:t>
       </w:r>
     </w:p>
     <w:p>
@@ -4332,7 +4474,7 @@
       </w:pPr>
       <w:r>
         <w:rPr/>
-        <w:t xml:space="preserve">Bon cadeau nominatif ou utilisable par toute personne détenant le code (module 6). </w:t>
+        <w:t xml:space="preserve">Durée de validité légale du bon cadeau — minimum 1 an, valeur exacte à définir (module 6). </w:t>
       </w:r>
     </w:p>
     <w:p>
@@ -4354,7 +4496,7 @@
       </w:pPr>
       <w:r>
         <w:rPr/>
-        <w:t xml:space="preserve">Durée de validité légale du bon cadeau — minimum 1 an, valeur exacte à définir (module 6). </w:t>
+        <w:t xml:space="preserve">Remboursement/annulation d'un bon cadeau non utilisé (module 6). </w:t>
       </w:r>
     </w:p>
     <w:p>
@@ -4369,6 +4511,39 @@
           <w:tab w:val="left" w:pos="707" w:leader="none"/>
         </w:tabs>
         <w:bidi w:val="0"/>
+        <w:ind w:left="707" w:hanging="283"/>
+        <w:jc w:val="left"/>
+        <w:rPr/>
+      </w:pPr>
+      <w:r>
+        <w:rPr/>
+        <w:t xml:space="preserve">Réutilisation du système de bons cadeaux pour émettre des avoirs gratuits en cas de litige (lien avec le point 4) (module 6) — probable vu la politique d'annulation (module 7), à confirmer explicitement. </w:t>
+      </w:r>
+    </w:p>
+    <w:p>
+      <w:pPr>
+        <w:pStyle w:val="Titre2"/>
+        <w:bidi w:val="0"/>
+        <w:jc w:val="left"/>
+        <w:rPr/>
+      </w:pPr>
+      <w:r>
+        <w:rPr/>
+        <w:t>Récapitulatif des points reportés en V2 (🔜)</w:t>
+      </w:r>
+    </w:p>
+    <w:p>
+      <w:pPr>
+        <w:pStyle w:val="Corpsdetexte"/>
+        <w:numPr>
+          <w:ilvl w:val="0"/>
+          <w:numId w:val="30"/>
+        </w:numPr>
+        <w:tabs>
+          <w:tab w:val="clear" w:pos="1134"/>
+          <w:tab w:val="left" w:pos="707" w:leader="none"/>
+        </w:tabs>
+        <w:bidi w:val="0"/>
         <w:spacing w:before="0" w:after="0"/>
         <w:ind w:left="707" w:hanging="283"/>
         <w:jc w:val="left"/>
@@ -4376,40 +4551,7 @@
       </w:pPr>
       <w:r>
         <w:rPr/>
-        <w:t xml:space="preserve">Remboursement/annulation d'un bon cadeau non utilisé (module 6). </w:t>
-      </w:r>
-    </w:p>
-    <w:p>
-      <w:pPr>
-        <w:pStyle w:val="Corpsdetexte"/>
-        <w:numPr>
-          <w:ilvl w:val="0"/>
-          <w:numId w:val="29"/>
-        </w:numPr>
-        <w:tabs>
-          <w:tab w:val="clear" w:pos="1134"/>
-          <w:tab w:val="left" w:pos="707" w:leader="none"/>
-        </w:tabs>
-        <w:bidi w:val="0"/>
-        <w:ind w:left="707" w:hanging="283"/>
-        <w:jc w:val="left"/>
-        <w:rPr/>
-      </w:pPr>
-      <w:r>
-        <w:rPr/>
-        <w:t xml:space="preserve">Réutilisation du système de bons cadeaux pour émettre des avoirs gratuits en cas de litige (lien avec le point 3) (module 6) — probable vu la politique d'annulation (module 7), à confirmer explicitement. </w:t>
-      </w:r>
-    </w:p>
-    <w:p>
-      <w:pPr>
-        <w:pStyle w:val="Titre2"/>
-        <w:bidi w:val="0"/>
-        <w:jc w:val="left"/>
-        <w:rPr/>
-      </w:pPr>
-      <w:r>
-        <w:rPr/>
-        <w:t>Récapitulatif des points reportés en V2 (🔜)</w:t>
+        <w:t xml:space="preserve">Outil de chat pour contacter la cliente — souhaité mais pas développé en V1 (module 2). </w:t>
       </w:r>
     </w:p>
     <w:p>
@@ -4431,7 +4573,7 @@
       </w:pPr>
       <w:r>
         <w:rPr/>
-        <w:t xml:space="preserve">Tranche horaire précise sélectionnable dans le tunnel de réservation (module 2) — la cliente envisage de l'ajouter plus tard, « pas dans l'immédiat ». En V1, l'heure se négocie hors tunnel (chat/téléphone/email). </w:t>
+        <w:t xml:space="preserve">Tranche horaire précise sélectionnable dans le tunnel de réservation (module 2) — la cliente envisage de l'ajouter plus tard, « pas dans l'immédiat ». En V1, l'heure se négocie hors tunnel (téléphone/email). </w:t>
       </w:r>
     </w:p>
     <w:p>

</xml_diff>